<commit_message>
feat(api): add user management & docs
Introduces full CRUD operations for users via new API endpoints.
Includes functionality to regenerate and retrieve user API keys.
A new API.md file provides comprehensive documentation for all endpoints.

BREAKING CHANGE: Product name changed from DocuSeal to SealRoute.
This affects product URLs and branding references.
</commit_message>
<xml_diff>
--- a/docs/samples/simple2.docx
+++ b/docs/samples/simple2.docx
@@ -678,11 +678,61 @@
       </w:r>
       <w:r>
         <w:rPr>
-          <w:sz w:val="10"/>
-          <w:szCs w:val="10"/>
           <w:lang w:val="en-US"/>
         </w:rPr>
         <w:t>{{</w:t>
+      </w:r>
+      <w:proofErr w:type="gramStart"/>
+      <w:r>
+        <w:rPr>
+          <w:lang w:val="en-US"/>
+        </w:rPr>
+        <w:t>CompanyStamp;type</w:t>
+      </w:r>
+      <w:proofErr w:type="gramEnd"/>
+      <w:r>
+        <w:rPr>
+          <w:lang w:val="en-US"/>
+        </w:rPr>
+        <w:t>=</w:t>
+      </w:r>
+      <w:proofErr w:type="gramStart"/>
+      <w:r>
+        <w:rPr>
+          <w:lang w:val="en-US"/>
+        </w:rPr>
+        <w:t>stamp;role</w:t>
+      </w:r>
+      <w:proofErr w:type="gramEnd"/>
+      <w:r>
+        <w:rPr>
+          <w:lang w:val="en-US"/>
+        </w:rPr>
+        <w:t>=Buyer</w:t>
+      </w:r>
+      <w:proofErr w:type="gramStart"/>
+      <w:r>
+        <w:rPr>
+          <w:lang w:val="en-US"/>
+        </w:rPr>
+        <w:t>}}</w:t>
+      </w:r>
+      <w:r>
+        <w:rPr>
+          <w:sz w:val="10"/>
+          <w:szCs w:val="10"/>
+          <w:lang w:val="en-US"/>
+        </w:rPr>
+        <w:t>{</w:t>
+      </w:r>
+      <w:proofErr w:type="gramEnd"/>
+      <w:r>
+        <w:rPr>
+          <w:sz w:val="10"/>
+          <w:szCs w:val="10"/>
+          <w:lang w:val="en-US"/>
+        </w:rPr>
+        <w:t>{</w:t>
       </w:r>
       <w:proofErr w:type="gramStart"/>
       <w:r>

</xml_diff>